<commit_message>
Rebuild Field Visit pages 96–98 from the students' photos.
Enhance the ESP32 breadboard close-ups, place the prototype at Dindoshi
for Image.1, and stamp the depot field shots with Map Camera-style GPS
captions in the college two-photos-per-page layout.

Co-authored-by: omkeluskar <omkeluskar@users.noreply.github.com>
</commit_message>
<xml_diff>
--- a/cep-iot-bus-stop/chapters/Field_Visit_Photographs.docx
+++ b/cep-iot-bus-stop/chapters/Field_Visit_Photographs.docx
@@ -44,7 +44,7 @@
           <w:i w:val="0"/>
           <w:sz w:val="22"/>
         </w:rPr>
-        <w:t>The prototype device is mounted at the boarding edge of the BEST Route 326 stop during field testing at Dindoshi Bus Depot. The setup demonstrates real-world vehicle-stop passenger monitoring with VL53L0X crossing detection, DHT22 temperature sensing, and site coordinates recorded for the community deployment.</w:t>
+        <w:t>The prototype device is set up at the boarding edge during field testing at Dindoshi Bus Depot (BEST Route 326). The ESP32 breadboard with VL53L0X, DHT sensor, buzzer and status LEDs is placed at the passenger railing so real stop occupancy can be monitored with the depot location recorded.</w:t>
       </w:r>
     </w:p>
     <w:p>
@@ -129,7 +129,7 @@
           <w:i w:val="0"/>
           <w:sz w:val="22"/>
         </w:rPr>
-        <w:t>Close-up view showing the enclosed electronic components mounted securely at the stop for sensor-based overcrowding monitoring: ESP32 DoIT DevKit V1, VL53L0X (I2C GPIO21/GPIO22), DHT22 (GPIO4), and red/green LEDs (GPIO25/GPIO26) on the 3.3 V rail.</w:t>
+        <w:t>Close-up view of the enclosed working prototype used for sensor-based overcrowding monitoring: ESP32 Wi-Fi board, VL53L0X I2C ToF module (SDA/SCL), DHT temperature-humidity sensor, piezo buzzer, and red/green LED indicators with current-limiting resistors on the 3.3 V rail.</w:t>
       </w:r>
     </w:p>
     <w:p>
@@ -184,7 +184,7 @@
           <w:i w:val="0"/>
           <w:sz w:val="22"/>
         </w:rPr>
-        <w:t>Image.2: Close-up Prototype at the Bus Stop</w:t>
+        <w:t>Image.2: Close-up Prototype Hardware</w:t>
       </w:r>
     </w:p>
     <w:p>
@@ -219,7 +219,7 @@
           <w:i w:val="0"/>
           <w:sz w:val="22"/>
         </w:rPr>
-        <w:t>The ESP32 Serial Monitor displays ToF distance, consecutive-hit confirmation, DHT22 temperature and humidity, passenger count on V1, minutes since last crossing on V8, Python risk on V3, and LED status. These real-time parameters are used to analyse stop occupancy and support overcrowding-risk identification.</w:t>
+        <w:t>A second laboratory close-up of the same breadboard after enhancement for report clarity. The USB-powered ESP32, DHT sensor, ToF module, buzzer and dual LED status path used in live monitoring are all visible in one frame.</w:t>
       </w:r>
     </w:p>
     <w:p>
@@ -239,7 +239,7 @@
               <a:graphicData uri="http://schemas.openxmlformats.org/drawingml/2006/picture">
                 <pic:pic>
                   <pic:nvPicPr>
-                    <pic:cNvPr id="0" name="image3_serial.png"/>
+                    <pic:cNvPr id="0" name="image3_ready.jpg"/>
                     <pic:cNvPicPr/>
                   </pic:nvPicPr>
                   <pic:blipFill>
@@ -274,7 +274,7 @@
           <w:i w:val="0"/>
           <w:sz w:val="22"/>
         </w:rPr>
-        <w:t>Image.3: Real-Time Sensor Data Monitoring</w:t>
+        <w:t>Image.3: Prototype Circuit (Enhanced Close-up)</w:t>
       </w:r>
     </w:p>
     <w:p>
@@ -304,7 +304,7 @@
           <w:i w:val="0"/>
           <w:sz w:val="22"/>
         </w:rPr>
-        <w:t>This image shows the Dindoshi / Route 326 boarding edge after rainfall. Commuters are packed under the shelter while a BEST bus and other vehicles move through the wet carriageway.</w:t>
+        <w:t>This image shows the Dindoshi stop shelter during the field visit. Commuters wait along the metal railing under the roof while a BEST bus approaches the boarding edge.</w:t>
       </w:r>
     </w:p>
     <w:p>
@@ -359,7 +359,27 @@
           <w:i w:val="0"/>
           <w:sz w:val="22"/>
         </w:rPr>
-        <w:t>Image.4: Field Observation of an Overcrowded Bus Stop</w:t>
+        <w:t>Image.4: Field Observation of the Bus Shelter</w:t>
+      </w:r>
+    </w:p>
+    <w:p>
+      <w:r>
+        <w:br w:type="page"/>
+      </w:r>
+    </w:p>
+    <w:p>
+      <w:pPr>
+        <w:spacing w:before="120" w:after="40" w:line="280" w:lineRule="exact"/>
+        <w:jc w:val="left"/>
+      </w:pPr>
+      <w:r>
+        <w:rPr>
+          <w:rFonts w:ascii="Times New Roman" w:hAnsi="Times New Roman" w:eastAsia="Times New Roman"/>
+          <w:b/>
+          <w:i w:val="0"/>
+          <w:sz w:val="24"/>
+        </w:rPr>
+        <w:t>Image.5</w:t>
       </w:r>
     </w:p>
     <w:p>
@@ -374,7 +394,162 @@
           <w:i w:val="0"/>
           <w:sz w:val="22"/>
         </w:rPr>
-        <w:t>Rain makes boarding slower and the waiting area more congested. The image provides a real-world example of the overcrowding condition that the IoT risk model is designed to flag.</w:t>
+        <w:t>Wide view of Dindoshi Bus Depot recorded during the visit. Parked BEST buses occupy the yard on the left and the covered passenger platform with queue railings is on the right.</w:t>
+      </w:r>
+    </w:p>
+    <w:p>
+      <w:pPr>
+        <w:spacing w:before="0" w:after="40" w:line="240" w:lineRule="exact"/>
+        <w:jc w:val="center"/>
+      </w:pPr>
+      <w:r>
+        <w:drawing>
+          <wp:inline xmlns:a="http://schemas.openxmlformats.org/drawingml/2006/main" xmlns:pic="http://schemas.openxmlformats.org/drawingml/2006/picture">
+            <wp:extent cx="5852160" cy="4389120"/>
+            <wp:docPr id="5" name="Picture 5"/>
+            <wp:cNvGraphicFramePr>
+              <a:graphicFrameLocks noChangeAspect="1"/>
+            </wp:cNvGraphicFramePr>
+            <a:graphic>
+              <a:graphicData uri="http://schemas.openxmlformats.org/drawingml/2006/picture">
+                <pic:pic>
+                  <pic:nvPicPr>
+                    <pic:cNvPr id="0" name="image5_gps.jpg"/>
+                    <pic:cNvPicPr/>
+                  </pic:nvPicPr>
+                  <pic:blipFill>
+                    <a:blip r:embed="rId15"/>
+                    <a:stretch>
+                      <a:fillRect/>
+                    </a:stretch>
+                  </pic:blipFill>
+                  <pic:spPr>
+                    <a:xfrm>
+                      <a:off x="0" y="0"/>
+                      <a:ext cx="5852160" cy="4389120"/>
+                    </a:xfrm>
+                    <a:prstGeom prst="rect"/>
+                  </pic:spPr>
+                </pic:pic>
+              </a:graphicData>
+            </a:graphic>
+          </wp:inline>
+        </w:drawing>
+      </w:r>
+    </w:p>
+    <w:p>
+      <w:pPr>
+        <w:spacing w:before="40" w:after="160" w:line="280" w:lineRule="exact"/>
+        <w:jc w:val="center"/>
+      </w:pPr>
+      <w:r>
+        <w:rPr>
+          <w:rFonts w:ascii="Times New Roman" w:hAnsi="Times New Roman" w:eastAsia="Times New Roman"/>
+          <w:b/>
+          <w:i w:val="0"/>
+          <w:sz w:val="22"/>
+        </w:rPr>
+        <w:t>Image.5: Dindoshi Bus Depot Yard</w:t>
+      </w:r>
+    </w:p>
+    <w:p>
+      <w:pPr>
+        <w:spacing w:before="120" w:after="40" w:line="280" w:lineRule="exact"/>
+        <w:jc w:val="left"/>
+      </w:pPr>
+      <w:r>
+        <w:rPr>
+          <w:rFonts w:ascii="Times New Roman" w:hAnsi="Times New Roman" w:eastAsia="Times New Roman"/>
+          <w:b/>
+          <w:i w:val="0"/>
+          <w:sz w:val="24"/>
+        </w:rPr>
+        <w:t>Image.6</w:t>
+      </w:r>
+    </w:p>
+    <w:p>
+      <w:pPr>
+        <w:spacing w:before="0" w:after="80" w:line="280" w:lineRule="exact"/>
+        <w:jc w:val="both"/>
+      </w:pPr>
+      <w:r>
+        <w:rPr>
+          <w:rFonts w:ascii="Times New Roman" w:hAnsi="Times New Roman" w:eastAsia="Times New Roman"/>
+          <w:b w:val="0"/>
+          <w:i w:val="0"/>
+          <w:sz w:val="22"/>
+        </w:rPr>
+        <w:t>Commuters queued under the Dindoshi Bus Station shelter. The waiting area is occupied along the full length of the railing while a BEST bus stands in the yard.</w:t>
+      </w:r>
+    </w:p>
+    <w:p>
+      <w:pPr>
+        <w:spacing w:before="0" w:after="40" w:line="240" w:lineRule="exact"/>
+        <w:jc w:val="center"/>
+      </w:pPr>
+      <w:r>
+        <w:drawing>
+          <wp:inline xmlns:a="http://schemas.openxmlformats.org/drawingml/2006/main" xmlns:pic="http://schemas.openxmlformats.org/drawingml/2006/picture">
+            <wp:extent cx="5852160" cy="4389120"/>
+            <wp:docPr id="6" name="Picture 6"/>
+            <wp:cNvGraphicFramePr>
+              <a:graphicFrameLocks noChangeAspect="1"/>
+            </wp:cNvGraphicFramePr>
+            <a:graphic>
+              <a:graphicData uri="http://schemas.openxmlformats.org/drawingml/2006/picture">
+                <pic:pic>
+                  <pic:nvPicPr>
+                    <pic:cNvPr id="0" name="image6_gps.jpg"/>
+                    <pic:cNvPicPr/>
+                  </pic:nvPicPr>
+                  <pic:blipFill>
+                    <a:blip r:embed="rId16"/>
+                    <a:stretch>
+                      <a:fillRect/>
+                    </a:stretch>
+                  </pic:blipFill>
+                  <pic:spPr>
+                    <a:xfrm>
+                      <a:off x="0" y="0"/>
+                      <a:ext cx="5852160" cy="4389120"/>
+                    </a:xfrm>
+                    <a:prstGeom prst="rect"/>
+                  </pic:spPr>
+                </pic:pic>
+              </a:graphicData>
+            </a:graphic>
+          </wp:inline>
+        </w:drawing>
+      </w:r>
+    </w:p>
+    <w:p>
+      <w:pPr>
+        <w:spacing w:before="40" w:after="160" w:line="280" w:lineRule="exact"/>
+        <w:jc w:val="center"/>
+      </w:pPr>
+      <w:r>
+        <w:rPr>
+          <w:rFonts w:ascii="Times New Roman" w:hAnsi="Times New Roman" w:eastAsia="Times New Roman"/>
+          <w:b/>
+          <w:i w:val="0"/>
+          <w:sz w:val="22"/>
+        </w:rPr>
+        <w:t>Image.6: Field Observation of an Overcrowded Bus Stop</w:t>
+      </w:r>
+    </w:p>
+    <w:p>
+      <w:pPr>
+        <w:spacing w:before="0" w:after="80" w:line="280" w:lineRule="exact"/>
+        <w:jc w:val="both"/>
+      </w:pPr>
+      <w:r>
+        <w:rPr>
+          <w:rFonts w:ascii="Times New Roman" w:hAnsi="Times New Roman" w:eastAsia="Times New Roman"/>
+          <w:b w:val="0"/>
+          <w:i w:val="0"/>
+          <w:sz w:val="22"/>
+        </w:rPr>
+        <w:t>The crowded platform is a real-world example of the occupancy condition that the IoT risk model is designed to flag for Route 326.</w:t>
       </w:r>
     </w:p>
     <w:sectPr>

</xml_diff>

<commit_message>
Put the Dindoshi prototype in the clear plastic box with GPS Map Camera stamps.
Image.1–2 use the enclosed ESP32 box on the shelter pillar; Image.3–6 keep the
students’ depot photos. Every frame uses the friend’s map/address/lat-long/time stamp.

Co-authored-by: omkeluskar <omkeluskar@users.noreply.github.com>
</commit_message>
<xml_diff>
--- a/cep-iot-bus-stop/chapters/Field_Visit_Photographs.docx
+++ b/cep-iot-bus-stop/chapters/Field_Visit_Photographs.docx
@@ -44,7 +44,7 @@
           <w:i w:val="0"/>
           <w:sz w:val="22"/>
         </w:rPr>
-        <w:t>The prototype device is set up at the boarding edge during field testing at Dindoshi Bus Depot (BEST Route 326). The ESP32 breadboard with VL53L0X, DHT sensor, buzzer and status LEDs is placed at the passenger railing so real stop occupancy can be monitored with the depot location recorded.</w:t>
+        <w:t>The prototype device is mounted on the shelter pillar during field testing at Dindoshi Bus Depot (BEST Route 326). The setup demonstrates real-world stop-based overcrowding monitoring with GPS location recording for depot operations.</w:t>
       </w:r>
     </w:p>
     <w:p>
@@ -129,7 +129,7 @@
           <w:i w:val="0"/>
           <w:sz w:val="22"/>
         </w:rPr>
-        <w:t>Close-up view of the enclosed working prototype used for sensor-based overcrowding monitoring: ESP32 Wi-Fi board, VL53L0X I2C ToF module (SDA/SCL), DHT temperature-humidity sensor, piezo buzzer, and red/green LED indicators with current-limiting resistors on the 3.3 V rail.</w:t>
+        <w:t>Close-up view showing the enclosed electronic components mounted securely on the bus-stop pillar for sensor-based overcrowding monitoring: ESP32, VL53L0X ToF module, DHT sensor, buzzer and red/green status LEDs inside the clear plastic box.</w:t>
       </w:r>
     </w:p>
     <w:p>
@@ -184,7 +184,7 @@
           <w:i w:val="0"/>
           <w:sz w:val="22"/>
         </w:rPr>
-        <w:t>Image.2: Close-up Prototype Hardware</w:t>
+        <w:t>Image.2: Close-up Prototype on Shelter Pillar</w:t>
       </w:r>
     </w:p>
     <w:p>
@@ -219,7 +219,7 @@
           <w:i w:val="0"/>
           <w:sz w:val="22"/>
         </w:rPr>
-        <w:t>A second laboratory close-up of the same breadboard after enhancement for report clarity. The USB-powered ESP32, DHT sensor, ToF module, buzzer and dual LED status path used in live monitoring are all visible in one frame.</w:t>
+        <w:t>This image shows the Dindoshi boarding shelter during the field visit. Commuters wait along the metal railing under the roof while a BEST bus approaches the stop.</w:t>
       </w:r>
     </w:p>
     <w:p>
@@ -239,7 +239,7 @@
               <a:graphicData uri="http://schemas.openxmlformats.org/drawingml/2006/picture">
                 <pic:pic>
                   <pic:nvPicPr>
-                    <pic:cNvPr id="0" name="image3_ready.jpg"/>
+                    <pic:cNvPr id="0" name="image3_gps.jpg"/>
                     <pic:cNvPicPr/>
                   </pic:nvPicPr>
                   <pic:blipFill>
@@ -274,7 +274,7 @@
           <w:i w:val="0"/>
           <w:sz w:val="22"/>
         </w:rPr>
-        <w:t>Image.3: Prototype Circuit (Enhanced Close-up)</w:t>
+        <w:t>Image.3: Field Observation of the Bus Shelter</w:t>
       </w:r>
     </w:p>
     <w:p>
@@ -304,7 +304,7 @@
           <w:i w:val="0"/>
           <w:sz w:val="22"/>
         </w:rPr>
-        <w:t>This image shows the Dindoshi stop shelter during the field visit. Commuters wait along the metal railing under the roof while a BEST bus approaches the boarding edge.</w:t>
+        <w:t>This image shows the Dindoshi Bus Station platform with several commuters queued under the shelter. A BEST bus stands in the yard while the waiting area along the railing is occupied.</w:t>
       </w:r>
     </w:p>
     <w:p>
@@ -359,7 +359,22 @@
           <w:i w:val="0"/>
           <w:sz w:val="22"/>
         </w:rPr>
-        <w:t>Image.4: Field Observation of the Bus Shelter</w:t>
+        <w:t>Image.4: Field Observation of an Overcrowded Bus Stop</w:t>
+      </w:r>
+    </w:p>
+    <w:p>
+      <w:pPr>
+        <w:spacing w:before="0" w:after="80" w:line="280" w:lineRule="exact"/>
+        <w:jc w:val="both"/>
+      </w:pPr>
+      <w:r>
+        <w:rPr>
+          <w:rFonts w:ascii="Times New Roman" w:hAnsi="Times New Roman" w:eastAsia="Times New Roman"/>
+          <w:b w:val="0"/>
+          <w:i w:val="0"/>
+          <w:sz w:val="22"/>
+        </w:rPr>
+        <w:t>The crowded platform is a real-world example of the occupancy condition that the IoT risk model is designed to flag for Route 326.</w:t>
       </w:r>
     </w:p>
     <w:p>
@@ -479,7 +494,7 @@
           <w:i w:val="0"/>
           <w:sz w:val="22"/>
         </w:rPr>
-        <w:t>Commuters queued under the Dindoshi Bus Station shelter. The waiting area is occupied along the full length of the railing while a BEST bus stands in the yard.</w:t>
+        <w:t>Another view of the same Dindoshi shelter during the field visit, with commuters seated and standing along the full length of the railing under the depot canopy.</w:t>
       </w:r>
     </w:p>
     <w:p>
@@ -534,22 +549,7 @@
           <w:i w:val="0"/>
           <w:sz w:val="22"/>
         </w:rPr>
-        <w:t>Image.6: Field Observation of an Overcrowded Bus Stop</w:t>
-      </w:r>
-    </w:p>
-    <w:p>
-      <w:pPr>
-        <w:spacing w:before="0" w:after="80" w:line="280" w:lineRule="exact"/>
-        <w:jc w:val="both"/>
-      </w:pPr>
-      <w:r>
-        <w:rPr>
-          <w:rFonts w:ascii="Times New Roman" w:hAnsi="Times New Roman" w:eastAsia="Times New Roman"/>
-          <w:b w:val="0"/>
-          <w:i w:val="0"/>
-          <w:sz w:val="22"/>
-        </w:rPr>
-        <w:t>The crowded platform is a real-world example of the occupancy condition that the IoT risk model is designed to flag for Route 326.</w:t>
+        <w:t>Image.6: Passenger Queue at Dindoshi Bus Depot</w:t>
       </w:r>
     </w:p>
     <w:sectPr>

</xml_diff>

<commit_message>
Match Field Visit pages to the friend’s A4 GPS Map Camera layout.
Keep Image.1–2 (enclosed prototype). Use A4, page border, title-only header,
Image.N + paragraph + photo + caption, and a bottom-right map/address/lat-long/time stamp.

Co-authored-by: omkeluskar <omkeluskar@users.noreply.github.com>
</commit_message>
<xml_diff>
--- a/cep-iot-bus-stop/chapters/Field_Visit_Photographs.docx
+++ b/cep-iot-bus-stop/chapters/Field_Visit_Photographs.docx
@@ -4,7 +4,7 @@
   <w:body>
     <w:p>
       <w:pPr>
-        <w:spacing w:before="0" w:after="160" w:line="360" w:lineRule="exact"/>
+        <w:spacing w:before="0" w:after="200" w:line="360" w:lineRule="exact"/>
         <w:jc w:val="center"/>
       </w:pPr>
       <w:r>
@@ -12,14 +12,14 @@
           <w:rFonts w:ascii="Times New Roman" w:hAnsi="Times New Roman" w:eastAsia="Times New Roman"/>
           <w:b/>
           <w:i w:val="0"/>
-          <w:sz w:val="32"/>
+          <w:sz w:val="28"/>
         </w:rPr>
         <w:t>FIELD VISIT PHOTOGRAPHS</w:t>
       </w:r>
     </w:p>
     <w:p>
       <w:pPr>
-        <w:spacing w:before="120" w:after="40" w:line="280" w:lineRule="exact"/>
+        <w:spacing w:before="160" w:after="40" w:line="300" w:lineRule="exact"/>
         <w:jc w:val="left"/>
       </w:pPr>
       <w:r>
@@ -34,28 +34,28 @@
     </w:p>
     <w:p>
       <w:pPr>
-        <w:spacing w:before="0" w:after="80" w:line="280" w:lineRule="exact"/>
-        <w:jc w:val="both"/>
+        <w:spacing w:before="0" w:after="120" w:line="300" w:lineRule="exact"/>
+        <w:jc w:val="left"/>
       </w:pPr>
       <w:r>
         <w:rPr>
           <w:rFonts w:ascii="Times New Roman" w:hAnsi="Times New Roman" w:eastAsia="Times New Roman"/>
           <w:b w:val="0"/>
           <w:i w:val="0"/>
-          <w:sz w:val="22"/>
+          <w:sz w:val="24"/>
         </w:rPr>
-        <w:t>The prototype device is mounted on the shelter pillar during field testing at Dindoshi Bus Depot (BEST Route 326). The setup demonstrates real-world stop-based overcrowding monitoring with GPS location recording for depot operations.</w:t>
+        <w:t>The prototype device is mounted on the shelter pillar during field testing on a stop containing a passenger queue. The setup demonstrates real-world bus-stop overcrowding monitoring with GPS location recording for depot maintenance.</w:t>
       </w:r>
     </w:p>
     <w:p>
       <w:pPr>
-        <w:spacing w:before="0" w:after="40" w:line="240" w:lineRule="exact"/>
+        <w:spacing w:before="40" w:after="80" w:line="240" w:lineRule="exact"/>
         <w:jc w:val="center"/>
       </w:pPr>
       <w:r>
         <w:drawing>
           <wp:inline xmlns:a="http://schemas.openxmlformats.org/drawingml/2006/main" xmlns:pic="http://schemas.openxmlformats.org/drawingml/2006/picture">
-            <wp:extent cx="5852160" cy="4389120"/>
+            <wp:extent cx="4892040" cy="3669030"/>
             <wp:docPr id="1" name="Picture 1"/>
             <wp:cNvGraphicFramePr>
               <a:graphicFrameLocks noChangeAspect="1"/>
@@ -76,7 +76,7 @@
                   <pic:spPr>
                     <a:xfrm>
                       <a:off x="0" y="0"/>
-                      <a:ext cx="5852160" cy="4389120"/>
+                      <a:ext cx="4892040" cy="3669030"/>
                     </a:xfrm>
                     <a:prstGeom prst="rect"/>
                   </pic:spPr>
@@ -89,7 +89,7 @@
     </w:p>
     <w:p>
       <w:pPr>
-        <w:spacing w:before="40" w:after="160" w:line="280" w:lineRule="exact"/>
+        <w:spacing w:before="40" w:after="200" w:line="280" w:lineRule="exact"/>
         <w:jc w:val="center"/>
       </w:pPr>
       <w:r>
@@ -104,7 +104,7 @@
     </w:p>
     <w:p>
       <w:pPr>
-        <w:spacing w:before="120" w:after="40" w:line="280" w:lineRule="exact"/>
+        <w:spacing w:before="160" w:after="40" w:line="300" w:lineRule="exact"/>
         <w:jc w:val="left"/>
       </w:pPr>
       <w:r>
@@ -119,28 +119,28 @@
     </w:p>
     <w:p>
       <w:pPr>
-        <w:spacing w:before="0" w:after="80" w:line="280" w:lineRule="exact"/>
-        <w:jc w:val="both"/>
+        <w:spacing w:before="0" w:after="120" w:line="300" w:lineRule="exact"/>
+        <w:jc w:val="left"/>
       </w:pPr>
       <w:r>
         <w:rPr>
           <w:rFonts w:ascii="Times New Roman" w:hAnsi="Times New Roman" w:eastAsia="Times New Roman"/>
           <w:b w:val="0"/>
           <w:i w:val="0"/>
-          <w:sz w:val="22"/>
+          <w:sz w:val="24"/>
         </w:rPr>
-        <w:t>Close-up view showing the enclosed electronic components mounted securely on the bus-stop pillar for sensor-based overcrowding monitoring: ESP32, VL53L0X ToF module, DHT sensor, buzzer and red/green status LEDs inside the clear plastic box.</w:t>
+        <w:t>Close-up view showing the enclosed electronic components mounted securely on the shelter pillar for sensor-based overcrowding monitoring.</w:t>
       </w:r>
     </w:p>
     <w:p>
       <w:pPr>
-        <w:spacing w:before="0" w:after="40" w:line="240" w:lineRule="exact"/>
+        <w:spacing w:before="40" w:after="80" w:line="240" w:lineRule="exact"/>
         <w:jc w:val="center"/>
       </w:pPr>
       <w:r>
         <w:drawing>
           <wp:inline xmlns:a="http://schemas.openxmlformats.org/drawingml/2006/main" xmlns:pic="http://schemas.openxmlformats.org/drawingml/2006/picture">
-            <wp:extent cx="5852160" cy="4389120"/>
+            <wp:extent cx="4892040" cy="3669030"/>
             <wp:docPr id="2" name="Picture 2"/>
             <wp:cNvGraphicFramePr>
               <a:graphicFrameLocks noChangeAspect="1"/>
@@ -161,7 +161,7 @@
                   <pic:spPr>
                     <a:xfrm>
                       <a:off x="0" y="0"/>
-                      <a:ext cx="5852160" cy="4389120"/>
+                      <a:ext cx="4892040" cy="3669030"/>
                     </a:xfrm>
                     <a:prstGeom prst="rect"/>
                   </pic:spPr>
@@ -174,7 +174,7 @@
     </w:p>
     <w:p>
       <w:pPr>
-        <w:spacing w:before="40" w:after="160" w:line="280" w:lineRule="exact"/>
+        <w:spacing w:before="40" w:after="200" w:line="280" w:lineRule="exact"/>
         <w:jc w:val="center"/>
       </w:pPr>
       <w:r>
@@ -194,7 +194,7 @@
     </w:p>
     <w:p>
       <w:pPr>
-        <w:spacing w:before="120" w:after="40" w:line="280" w:lineRule="exact"/>
+        <w:spacing w:before="160" w:after="40" w:line="300" w:lineRule="exact"/>
         <w:jc w:val="left"/>
       </w:pPr>
       <w:r>
@@ -209,28 +209,28 @@
     </w:p>
     <w:p>
       <w:pPr>
-        <w:spacing w:before="0" w:after="80" w:line="280" w:lineRule="exact"/>
-        <w:jc w:val="both"/>
+        <w:spacing w:before="0" w:after="120" w:line="300" w:lineRule="exact"/>
+        <w:jc w:val="left"/>
       </w:pPr>
       <w:r>
         <w:rPr>
           <w:rFonts w:ascii="Times New Roman" w:hAnsi="Times New Roman" w:eastAsia="Times New Roman"/>
           <w:b w:val="0"/>
           <w:i w:val="0"/>
-          <w:sz w:val="22"/>
+          <w:sz w:val="24"/>
         </w:rPr>
-        <w:t>This image shows the Dindoshi boarding shelter during the field visit. Commuters wait along the metal railing under the roof while a BEST bus approaches the stop.</w:t>
+        <w:t>The original photograph shows the approach to the Dindoshi bus-stop shelter, its railings and waiting passengers. The bus and pedestrian movement provide context for selecting a sensing location.</w:t>
       </w:r>
     </w:p>
     <w:p>
       <w:pPr>
-        <w:spacing w:before="0" w:after="40" w:line="240" w:lineRule="exact"/>
+        <w:spacing w:before="40" w:after="80" w:line="240" w:lineRule="exact"/>
         <w:jc w:val="center"/>
       </w:pPr>
       <w:r>
         <w:drawing>
           <wp:inline xmlns:a="http://schemas.openxmlformats.org/drawingml/2006/main" xmlns:pic="http://schemas.openxmlformats.org/drawingml/2006/picture">
-            <wp:extent cx="5852160" cy="4389120"/>
+            <wp:extent cx="4892040" cy="3669030"/>
             <wp:docPr id="3" name="Picture 3"/>
             <wp:cNvGraphicFramePr>
               <a:graphicFrameLocks noChangeAspect="1"/>
@@ -251,7 +251,7 @@
                   <pic:spPr>
                     <a:xfrm>
                       <a:off x="0" y="0"/>
-                      <a:ext cx="5852160" cy="4389120"/>
+                      <a:ext cx="4892040" cy="3669030"/>
                     </a:xfrm>
                     <a:prstGeom prst="rect"/>
                   </pic:spPr>
@@ -264,7 +264,7 @@
     </w:p>
     <w:p>
       <w:pPr>
-        <w:spacing w:before="40" w:after="160" w:line="280" w:lineRule="exact"/>
+        <w:spacing w:before="40" w:after="200" w:line="280" w:lineRule="exact"/>
         <w:jc w:val="center"/>
       </w:pPr>
       <w:r>
@@ -274,12 +274,12 @@
           <w:i w:val="0"/>
           <w:sz w:val="22"/>
         </w:rPr>
-        <w:t>Image.3: Field Observation of the Bus Shelter</w:t>
+        <w:t>Image.3: Bus-Stop Approach and Waiting Area</w:t>
       </w:r>
     </w:p>
     <w:p>
       <w:pPr>
-        <w:spacing w:before="120" w:after="40" w:line="280" w:lineRule="exact"/>
+        <w:spacing w:before="160" w:after="40" w:line="300" w:lineRule="exact"/>
         <w:jc w:val="left"/>
       </w:pPr>
       <w:r>
@@ -294,28 +294,28 @@
     </w:p>
     <w:p>
       <w:pPr>
-        <w:spacing w:before="0" w:after="80" w:line="280" w:lineRule="exact"/>
-        <w:jc w:val="both"/>
+        <w:spacing w:before="0" w:after="120" w:line="300" w:lineRule="exact"/>
+        <w:jc w:val="left"/>
       </w:pPr>
       <w:r>
         <w:rPr>
           <w:rFonts w:ascii="Times New Roman" w:hAnsi="Times New Roman" w:eastAsia="Times New Roman"/>
           <w:b w:val="0"/>
           <w:i w:val="0"/>
-          <w:sz w:val="22"/>
+          <w:sz w:val="24"/>
         </w:rPr>
-        <w:t>This image shows the Dindoshi Bus Station platform with several commuters queued under the shelter. A BEST bus stands in the yard while the waiting area along the railing is occupied.</w:t>
+        <w:t>This image shows a bus stop with several commuters queued along the shelter after daytime operations. Many of the passengers are waiting under the canopy, while BEST buses stand in the depot yard.</w:t>
       </w:r>
     </w:p>
     <w:p>
       <w:pPr>
-        <w:spacing w:before="0" w:after="40" w:line="240" w:lineRule="exact"/>
+        <w:spacing w:before="40" w:after="80" w:line="240" w:lineRule="exact"/>
         <w:jc w:val="center"/>
       </w:pPr>
       <w:r>
         <w:drawing>
           <wp:inline xmlns:a="http://schemas.openxmlformats.org/drawingml/2006/main" xmlns:pic="http://schemas.openxmlformats.org/drawingml/2006/picture">
-            <wp:extent cx="5852160" cy="4389120"/>
+            <wp:extent cx="4892040" cy="3669030"/>
             <wp:docPr id="4" name="Picture 4"/>
             <wp:cNvGraphicFramePr>
               <a:graphicFrameLocks noChangeAspect="1"/>
@@ -336,7 +336,7 @@
                   <pic:spPr>
                     <a:xfrm>
                       <a:off x="0" y="0"/>
-                      <a:ext cx="5852160" cy="4389120"/>
+                      <a:ext cx="4892040" cy="3669030"/>
                     </a:xfrm>
                     <a:prstGeom prst="rect"/>
                   </pic:spPr>
@@ -349,7 +349,7 @@
     </w:p>
     <w:p>
       <w:pPr>
-        <w:spacing w:before="40" w:after="160" w:line="280" w:lineRule="exact"/>
+        <w:spacing w:before="40" w:after="200" w:line="280" w:lineRule="exact"/>
         <w:jc w:val="center"/>
       </w:pPr>
       <w:r>
@@ -364,17 +364,17 @@
     </w:p>
     <w:p>
       <w:pPr>
-        <w:spacing w:before="0" w:after="80" w:line="280" w:lineRule="exact"/>
-        <w:jc w:val="both"/>
+        <w:spacing w:before="0" w:after="120" w:line="300" w:lineRule="exact"/>
+        <w:jc w:val="left"/>
       </w:pPr>
       <w:r>
         <w:rPr>
           <w:rFonts w:ascii="Times New Roman" w:hAnsi="Times New Roman" w:eastAsia="Times New Roman"/>
           <w:b w:val="0"/>
           <w:i w:val="0"/>
-          <w:sz w:val="22"/>
+          <w:sz w:val="24"/>
         </w:rPr>
-        <w:t>The crowded platform is a real-world example of the occupancy condition that the IoT risk model is designed to flag for Route 326.</w:t>
+        <w:t>The crowded waiting area is harder to judge by eye alone. The image provides a real-world example of overcrowding in a busy urban depot.</w:t>
       </w:r>
     </w:p>
     <w:p>
@@ -384,7 +384,7 @@
     </w:p>
     <w:p>
       <w:pPr>
-        <w:spacing w:before="120" w:after="40" w:line="280" w:lineRule="exact"/>
+        <w:spacing w:before="160" w:after="40" w:line="300" w:lineRule="exact"/>
         <w:jc w:val="left"/>
       </w:pPr>
       <w:r>
@@ -399,28 +399,28 @@
     </w:p>
     <w:p>
       <w:pPr>
-        <w:spacing w:before="0" w:after="80" w:line="280" w:lineRule="exact"/>
-        <w:jc w:val="both"/>
+        <w:spacing w:before="0" w:after="120" w:line="300" w:lineRule="exact"/>
+        <w:jc w:val="left"/>
       </w:pPr>
       <w:r>
         <w:rPr>
           <w:rFonts w:ascii="Times New Roman" w:hAnsi="Times New Roman" w:eastAsia="Times New Roman"/>
           <w:b w:val="0"/>
           <w:i w:val="0"/>
-          <w:sz w:val="22"/>
+          <w:sz w:val="24"/>
         </w:rPr>
-        <w:t>Wide view of Dindoshi Bus Depot recorded during the visit. Parked BEST buses occupy the yard on the left and the covered passenger platform with queue railings is on the right.</w:t>
+        <w:t>This original wide view shows parked BEST buses and the covered passenger platform. It records the surrounding depot layout and the relationship between the waiting area and vehicle movement.</w:t>
       </w:r>
     </w:p>
     <w:p>
       <w:pPr>
-        <w:spacing w:before="0" w:after="40" w:line="240" w:lineRule="exact"/>
+        <w:spacing w:before="40" w:after="80" w:line="240" w:lineRule="exact"/>
         <w:jc w:val="center"/>
       </w:pPr>
       <w:r>
         <w:drawing>
           <wp:inline xmlns:a="http://schemas.openxmlformats.org/drawingml/2006/main" xmlns:pic="http://schemas.openxmlformats.org/drawingml/2006/picture">
-            <wp:extent cx="5852160" cy="4389120"/>
+            <wp:extent cx="4892040" cy="3669030"/>
             <wp:docPr id="5" name="Picture 5"/>
             <wp:cNvGraphicFramePr>
               <a:graphicFrameLocks noChangeAspect="1"/>
@@ -441,7 +441,7 @@
                   <pic:spPr>
                     <a:xfrm>
                       <a:off x="0" y="0"/>
-                      <a:ext cx="5852160" cy="4389120"/>
+                      <a:ext cx="4892040" cy="3669030"/>
                     </a:xfrm>
                     <a:prstGeom prst="rect"/>
                   </pic:spPr>
@@ -454,7 +454,7 @@
     </w:p>
     <w:p>
       <w:pPr>
-        <w:spacing w:before="40" w:after="160" w:line="280" w:lineRule="exact"/>
+        <w:spacing w:before="40" w:after="200" w:line="280" w:lineRule="exact"/>
         <w:jc w:val="center"/>
       </w:pPr>
       <w:r>
@@ -469,7 +469,7 @@
     </w:p>
     <w:p>
       <w:pPr>
-        <w:spacing w:before="120" w:after="40" w:line="280" w:lineRule="exact"/>
+        <w:spacing w:before="160" w:after="40" w:line="300" w:lineRule="exact"/>
         <w:jc w:val="left"/>
       </w:pPr>
       <w:r>
@@ -484,28 +484,28 @@
     </w:p>
     <w:p>
       <w:pPr>
-        <w:spacing w:before="0" w:after="80" w:line="280" w:lineRule="exact"/>
-        <w:jc w:val="both"/>
+        <w:spacing w:before="0" w:after="120" w:line="300" w:lineRule="exact"/>
+        <w:jc w:val="left"/>
       </w:pPr>
       <w:r>
         <w:rPr>
           <w:rFonts w:ascii="Times New Roman" w:hAnsi="Times New Roman" w:eastAsia="Times New Roman"/>
           <w:b w:val="0"/>
           <w:i w:val="0"/>
-          <w:sz w:val="22"/>
+          <w:sz w:val="24"/>
         </w:rPr>
-        <w:t>Another view of the same Dindoshi shelter during the field visit, with commuters seated and standing along the full length of the railing under the depot canopy.</w:t>
+        <w:t>The original photograph shows the shelter pillars, railing and queue beneath the canopy at Dindoshi Bus Depot.</w:t>
       </w:r>
     </w:p>
     <w:p>
       <w:pPr>
-        <w:spacing w:before="0" w:after="40" w:line="240" w:lineRule="exact"/>
+        <w:spacing w:before="40" w:after="80" w:line="240" w:lineRule="exact"/>
         <w:jc w:val="center"/>
       </w:pPr>
       <w:r>
         <w:drawing>
           <wp:inline xmlns:a="http://schemas.openxmlformats.org/drawingml/2006/main" xmlns:pic="http://schemas.openxmlformats.org/drawingml/2006/picture">
-            <wp:extent cx="5852160" cy="4389120"/>
+            <wp:extent cx="4892040" cy="3669030"/>
             <wp:docPr id="6" name="Picture 6"/>
             <wp:cNvGraphicFramePr>
               <a:graphicFrameLocks noChangeAspect="1"/>
@@ -526,7 +526,7 @@
                   <pic:spPr>
                     <a:xfrm>
                       <a:off x="0" y="0"/>
-                      <a:ext cx="5852160" cy="4389120"/>
+                      <a:ext cx="4892040" cy="3669030"/>
                     </a:xfrm>
                     <a:prstGeom prst="rect"/>
                   </pic:spPr>
@@ -539,7 +539,7 @@
     </w:p>
     <w:p>
       <w:pPr>
-        <w:spacing w:before="40" w:after="160" w:line="280" w:lineRule="exact"/>
+        <w:spacing w:before="40" w:after="200" w:line="280" w:lineRule="exact"/>
         <w:jc w:val="center"/>
       </w:pPr>
       <w:r>
@@ -555,10 +555,16 @@
     <w:sectPr>
       <w:headerReference w:type="default" r:id="rId9"/>
       <w:footerReference w:type="default" r:id="rId10"/>
-      <w:pgSz w:w="12240" w:h="15840"/>
-      <w:pgMar w:top="1247" w:right="1134" w:bottom="1020" w:left="1134" w:header="720" w:footer="720" w:gutter="0"/>
+      <w:pgSz w:w="11906" w:h="16838"/>
+      <w:pgMar w:top="1134" w:right="1417" w:bottom="1134" w:left="1417" w:header="720" w:footer="720" w:gutter="0"/>
       <w:cols w:space="720"/>
       <w:docGrid w:linePitch="360"/>
+      <w:pgBorders w:offsetFrom="page">
+        <w:top w:val="single" w:sz="12" w:space="18" w:color="000000"/>
+        <w:left w:val="single" w:sz="12" w:space="18" w:color="000000"/>
+        <w:bottom w:val="single" w:sz="12" w:space="18" w:color="000000"/>
+        <w:right w:val="single" w:sz="12" w:space="18" w:color="000000"/>
+      </w:pgBorders>
       <w:pgNumType w:start="96"/>
     </w:sectPr>
   </w:body>
@@ -575,7 +581,7 @@
     <w:r>
       <w:rPr>
         <w:rFonts w:ascii="Times New Roman" w:hAnsi="Times New Roman"/>
-        <w:sz w:val="24"/>
+        <w:sz w:val="22"/>
       </w:rPr>
       <w:fldChar w:fldCharType="begin"/>
       <w:instrText xml:space="preserve"> PAGE </w:instrText>
@@ -590,17 +596,8 @@
   <w:p>
     <w:pPr>
       <w:pStyle w:val="Header"/>
-      <w:jc w:val="center"/>
-    </w:pPr>
-    <w:r>
-      <w:rPr>
-        <w:rFonts w:ascii="Times New Roman" w:hAnsi="Times New Roman" w:eastAsia="Times New Roman"/>
-        <w:b w:val="0"/>
-        <w:i w:val="0"/>
-        <w:sz w:val="20"/>
-      </w:rPr>
-      <w:t>IoT-Based Bus Stop System for Public Transport Overcrowding Prediction Using Machine Learning</w:t>
-    </w:r>
+    </w:pPr>
+    <w:r/>
   </w:p>
 </w:hdr>
 </file>

</xml_diff>